<commit_message>
Atualiza documentacao tecnica (.docx) com features da sessao v3.9.0-3.11.8
- Sistema de permissoes por perfil (Admin/Usuario comum)
- Flags de fornecedor (Declinio, Pesquisa Internet, Pesquisa Compra Publica)
- PWA, autocomplete + corretor ortografico
- Linha extra de preco (fixo R$ ou percentual, sinal +/-)
- Frete (Sim/Nao) e termo (CIF/FOB) independentes
- Tipos de Contratacao e Itens Extras gerenciaveis
- Indicador de versao na sidebar
- Modelo de dados: doze tabelas (era sete), campos novos de fornecedores
- Endpoints da API: tipos-contratacao, tipos-extra, config, autocomplete,
  admin/users, version
- admin.html: 6 abas (era 3)
- Removida limitacao "sem controle de permissoes" (ja implementado)
- Dependencia an-array-of-portuguese-words adicionada ao stack
</commit_message>
<xml_diff>
--- a/SECOP_Cotacoes_Documentacao_Tecnica.docx
+++ b/SECOP_Cotacoes_Documentacao_Tecnica.docx
@@ -74,6 +74,21 @@
           <w:szCs w:val="22"/>
         </w:rPr>
         <w:t xml:space="preserve">Versão 1.0 — MVP</w:t>
+      </w:r>
+    </w:p>
+    <w:p>
+      <w:pPr>
+        <w:spacing w:after="40"/>
+        <w:jc w:val="center"/>
+      </w:pPr>
+      <w:r>
+        <w:rPr>
+          <w:b/>
+          <w:bCs/>
+          <w:sz w:val="22"/>
+          <w:szCs w:val="22"/>
+        </w:rPr>
+        <w:t>Atualizado em 23/07/2026 — reflete a versão 3.11.8 da aplicação</w:t>
       </w:r>
     </w:p>
     <w:p>
@@ -1053,7 +1068,7 @@
         <w:spacing w:after="160"/>
       </w:pPr>
       <w:r>
-        <w:t xml:space="preserve">O projeto adota uma política deliberada de minimização de dependências externas. Com exceção do framework Express, todas as demais funcionalidades — análise de cookies, gestão de sessões, upload de arquivos e acesso ao banco de dados — são implementadas por meio de módulos nativos do Node.js.</w:t>
+        <w:t>O projeto adota uma política deliberada de minimização de dependências externas. Com exceção do framework Express e do pacote de dicionário PT-BR usado no corretor ortográfico/autocomplete (an-array-of-portuguese-words), todas as demais funcionalidades — análise de cookies, gestão de sessões, upload de arquivos, hash de senha e acesso ao banco de dados — são implementadas por meio de módulos nativos do Node.js.</w:t>
       </w:r>
     </w:p>
     <w:p>
@@ -1071,9 +1086,11 @@
           <w:sz w:val="18"/>
           <w:szCs w:val="18"/>
         </w:rPr>
-        <w:t xml:space="preserve">{</w:t>
+        <w:t>{</w:t>
         <w:br/>
         <w:t xml:space="preserve">  "dependencies": {</w:t>
+        <w:br/>
+        <w:t xml:space="preserve">    "an-array-of-portuguese-words": "^1.2.0",</w:t>
         <w:br/>
         <w:t xml:space="preserve">    "express": "^4.18.2"</w:t>
         <w:br/>
@@ -1085,7 +1102,7 @@
         <w:br/>
         <w:t xml:space="preserve">  }</w:t>
         <w:br/>
-        <w:t xml:space="preserve">}</w:t>
+        <w:t>}</w:t>
       </w:r>
     </w:p>
     <w:p>
@@ -3931,6 +3948,810 @@
           </w:p>
         </w:tc>
       </w:tr>
+      <w:tr>
+        <w:tc>
+          <w:tcPr>
+            <w:tcW w:type="dxa" w:w="1700"/>
+            <w:tcBorders>
+              <w:top w:val="single" w:color="CCCCCC" w:sz="1"/>
+              <w:left w:val="single" w:color="CCCCCC" w:sz="1"/>
+              <w:bottom w:val="single" w:color="CCCCCC" w:sz="1"/>
+              <w:right w:val="single" w:color="CCCCCC" w:sz="1"/>
+            </w:tcBorders>
+            <w:shd w:fill="F2F2F2" w:val="clear"/>
+            <w:tcMar>
+              <w:top w:type="dxa" w:w="80"/>
+              <w:left w:type="dxa" w:w="120"/>
+              <w:bottom w:type="dxa" w:w="80"/>
+              <w:right w:type="dxa" w:w="120"/>
+            </w:tcMar>
+            <w:vAlign w:val="center"/>
+          </w:tcPr>
+          <w:p>
+            <w:pPr>
+              <w:jc w:val="left"/>
+            </w:pPr>
+            <w:r>
+              <w:rPr>
+                <w:b w:val="false"/>
+                <w:bCs w:val="false"/>
+                <w:sz w:val="20"/>
+                <w:szCs w:val="20"/>
+              </w:rPr>
+              <w:t>Tipos</w:t>
+            </w:r>
+          </w:p>
+        </w:tc>
+        <w:tc>
+          <w:tcPr>
+            <w:tcW w:type="dxa" w:w="1100"/>
+            <w:tcBorders>
+              <w:top w:val="single" w:color="CCCCCC" w:sz="1"/>
+              <w:left w:val="single" w:color="CCCCCC" w:sz="1"/>
+              <w:bottom w:val="single" w:color="CCCCCC" w:sz="1"/>
+              <w:right w:val="single" w:color="CCCCCC" w:sz="1"/>
+            </w:tcBorders>
+            <w:shd w:fill="F2F2F2" w:val="clear"/>
+            <w:tcMar>
+              <w:top w:type="dxa" w:w="80"/>
+              <w:left w:type="dxa" w:w="120"/>
+              <w:bottom w:type="dxa" w:w="80"/>
+              <w:right w:type="dxa" w:w="120"/>
+            </w:tcMar>
+            <w:vAlign w:val="center"/>
+          </w:tcPr>
+          <w:p>
+            <w:pPr>
+              <w:jc w:val="left"/>
+            </w:pPr>
+            <w:r>
+              <w:rPr>
+                <w:b w:val="false"/>
+                <w:bCs w:val="false"/>
+                <w:sz w:val="20"/>
+                <w:szCs w:val="20"/>
+              </w:rPr>
+              <w:t>GET/POST/PUT/DELETE</w:t>
+            </w:r>
+          </w:p>
+        </w:tc>
+        <w:tc>
+          <w:tcPr>
+            <w:tcW w:type="dxa" w:w="2900"/>
+            <w:tcBorders>
+              <w:top w:val="single" w:color="CCCCCC" w:sz="1"/>
+              <w:left w:val="single" w:color="CCCCCC" w:sz="1"/>
+              <w:bottom w:val="single" w:color="CCCCCC" w:sz="1"/>
+              <w:right w:val="single" w:color="CCCCCC" w:sz="1"/>
+            </w:tcBorders>
+            <w:shd w:fill="F2F2F2" w:val="clear"/>
+            <w:tcMar>
+              <w:top w:type="dxa" w:w="80"/>
+              <w:left w:type="dxa" w:w="120"/>
+              <w:bottom w:type="dxa" w:w="80"/>
+              <w:right w:type="dxa" w:w="120"/>
+            </w:tcMar>
+            <w:vAlign w:val="center"/>
+          </w:tcPr>
+          <w:p>
+            <w:pPr>
+              <w:jc w:val="left"/>
+            </w:pPr>
+            <w:r>
+              <w:rPr>
+                <w:b w:val="false"/>
+                <w:bCs w:val="false"/>
+                <w:sz w:val="18"/>
+                <w:szCs w:val="18"/>
+              </w:rPr>
+              <w:t>/api/tipos-contratacao(/:id)</w:t>
+            </w:r>
+          </w:p>
+        </w:tc>
+        <w:tc>
+          <w:tcPr>
+            <w:tcW w:type="dxa" w:w="3326"/>
+            <w:tcBorders>
+              <w:top w:val="single" w:color="CCCCCC" w:sz="1"/>
+              <w:left w:val="single" w:color="CCCCCC" w:sz="1"/>
+              <w:bottom w:val="single" w:color="CCCCCC" w:sz="1"/>
+              <w:right w:val="single" w:color="CCCCCC" w:sz="1"/>
+            </w:tcBorders>
+            <w:shd w:fill="F2F2F2" w:val="clear"/>
+            <w:tcMar>
+              <w:top w:type="dxa" w:w="80"/>
+              <w:left w:type="dxa" w:w="120"/>
+              <w:bottom w:type="dxa" w:w="80"/>
+              <w:right w:type="dxa" w:w="120"/>
+            </w:tcMar>
+            <w:vAlign w:val="center"/>
+          </w:tcPr>
+          <w:p>
+            <w:pPr>
+              <w:jc w:val="left"/>
+            </w:pPr>
+            <w:r>
+              <w:rPr>
+                <w:b w:val="false"/>
+                <w:bCs w:val="false"/>
+                <w:sz w:val="20"/>
+                <w:szCs w:val="20"/>
+              </w:rPr>
+              <w:t>Catálogo de tipos de contratação (escrita restrita a admin)</w:t>
+            </w:r>
+          </w:p>
+        </w:tc>
+      </w:tr>
+      <w:tr>
+        <w:tc>
+          <w:tcPr>
+            <w:tcW w:type="dxa" w:w="1700"/>
+            <w:tcBorders>
+              <w:top w:val="single" w:color="CCCCCC" w:sz="1"/>
+              <w:left w:val="single" w:color="CCCCCC" w:sz="1"/>
+              <w:bottom w:val="single" w:color="CCCCCC" w:sz="1"/>
+              <w:right w:val="single" w:color="CCCCCC" w:sz="1"/>
+            </w:tcBorders>
+            <w:shd w:fill="F2F2F2" w:val="clear"/>
+            <w:tcMar>
+              <w:top w:type="dxa" w:w="80"/>
+              <w:left w:type="dxa" w:w="120"/>
+              <w:bottom w:type="dxa" w:w="80"/>
+              <w:right w:type="dxa" w:w="120"/>
+            </w:tcMar>
+            <w:vAlign w:val="center"/>
+          </w:tcPr>
+          <w:p>
+            <w:pPr>
+              <w:jc w:val="left"/>
+            </w:pPr>
+            <w:r>
+              <w:rPr>
+                <w:b w:val="false"/>
+                <w:bCs w:val="false"/>
+                <w:sz w:val="20"/>
+                <w:szCs w:val="20"/>
+              </w:rPr>
+              <w:t>Tipos</w:t>
+            </w:r>
+          </w:p>
+        </w:tc>
+        <w:tc>
+          <w:tcPr>
+            <w:tcW w:type="dxa" w:w="1100"/>
+            <w:tcBorders>
+              <w:top w:val="single" w:color="CCCCCC" w:sz="1"/>
+              <w:left w:val="single" w:color="CCCCCC" w:sz="1"/>
+              <w:bottom w:val="single" w:color="CCCCCC" w:sz="1"/>
+              <w:right w:val="single" w:color="CCCCCC" w:sz="1"/>
+            </w:tcBorders>
+            <w:shd w:fill="F2F2F2" w:val="clear"/>
+            <w:tcMar>
+              <w:top w:type="dxa" w:w="80"/>
+              <w:left w:type="dxa" w:w="120"/>
+              <w:bottom w:type="dxa" w:w="80"/>
+              <w:right w:type="dxa" w:w="120"/>
+            </w:tcMar>
+            <w:vAlign w:val="center"/>
+          </w:tcPr>
+          <w:p>
+            <w:pPr>
+              <w:jc w:val="left"/>
+            </w:pPr>
+            <w:r>
+              <w:rPr>
+                <w:b w:val="false"/>
+                <w:bCs w:val="false"/>
+                <w:sz w:val="20"/>
+                <w:szCs w:val="20"/>
+              </w:rPr>
+              <w:t>GET/POST/PUT/DELETE</w:t>
+            </w:r>
+          </w:p>
+        </w:tc>
+        <w:tc>
+          <w:tcPr>
+            <w:tcW w:type="dxa" w:w="2900"/>
+            <w:tcBorders>
+              <w:top w:val="single" w:color="CCCCCC" w:sz="1"/>
+              <w:left w:val="single" w:color="CCCCCC" w:sz="1"/>
+              <w:bottom w:val="single" w:color="CCCCCC" w:sz="1"/>
+              <w:right w:val="single" w:color="CCCCCC" w:sz="1"/>
+            </w:tcBorders>
+            <w:shd w:fill="F2F2F2" w:val="clear"/>
+            <w:tcMar>
+              <w:top w:type="dxa" w:w="80"/>
+              <w:left w:type="dxa" w:w="120"/>
+              <w:bottom w:type="dxa" w:w="80"/>
+              <w:right w:type="dxa" w:w="120"/>
+            </w:tcMar>
+            <w:vAlign w:val="center"/>
+          </w:tcPr>
+          <w:p>
+            <w:pPr>
+              <w:jc w:val="left"/>
+            </w:pPr>
+            <w:r>
+              <w:rPr>
+                <w:b w:val="false"/>
+                <w:bCs w:val="false"/>
+                <w:sz w:val="18"/>
+                <w:szCs w:val="18"/>
+              </w:rPr>
+              <w:t>/api/tipos-extra(/:id)</w:t>
+            </w:r>
+          </w:p>
+        </w:tc>
+        <w:tc>
+          <w:tcPr>
+            <w:tcW w:type="dxa" w:w="3326"/>
+            <w:tcBorders>
+              <w:top w:val="single" w:color="CCCCCC" w:sz="1"/>
+              <w:left w:val="single" w:color="CCCCCC" w:sz="1"/>
+              <w:bottom w:val="single" w:color="CCCCCC" w:sz="1"/>
+              <w:right w:val="single" w:color="CCCCCC" w:sz="1"/>
+            </w:tcBorders>
+            <w:shd w:fill="F2F2F2" w:val="clear"/>
+            <w:tcMar>
+              <w:top w:type="dxa" w:w="80"/>
+              <w:left w:type="dxa" w:w="120"/>
+              <w:bottom w:type="dxa" w:w="80"/>
+              <w:right w:type="dxa" w:w="120"/>
+            </w:tcMar>
+            <w:vAlign w:val="center"/>
+          </w:tcPr>
+          <w:p>
+            <w:pPr>
+              <w:jc w:val="left"/>
+            </w:pPr>
+            <w:r>
+              <w:rPr>
+                <w:b w:val="false"/>
+                <w:bCs w:val="false"/>
+                <w:sz w:val="20"/>
+                <w:szCs w:val="20"/>
+              </w:rPr>
+              <w:t>Catálogo de linhas extras de preço — unidade, sinal e tipo de valor (escrita restrita a admin)</w:t>
+            </w:r>
+          </w:p>
+        </w:tc>
+      </w:tr>
+      <w:tr>
+        <w:tc>
+          <w:tcPr>
+            <w:tcW w:type="dxa" w:w="1700"/>
+            <w:tcBorders>
+              <w:top w:val="single" w:color="CCCCCC" w:sz="1"/>
+              <w:left w:val="single" w:color="CCCCCC" w:sz="1"/>
+              <w:bottom w:val="single" w:color="CCCCCC" w:sz="1"/>
+              <w:right w:val="single" w:color="CCCCCC" w:sz="1"/>
+            </w:tcBorders>
+            <w:shd w:fill="F2F2F2" w:val="clear"/>
+            <w:tcMar>
+              <w:top w:type="dxa" w:w="80"/>
+              <w:left w:type="dxa" w:w="120"/>
+              <w:bottom w:type="dxa" w:w="80"/>
+              <w:right w:type="dxa" w:w="120"/>
+            </w:tcMar>
+            <w:vAlign w:val="center"/>
+          </w:tcPr>
+          <w:p>
+            <w:pPr>
+              <w:jc w:val="left"/>
+            </w:pPr>
+            <w:r>
+              <w:rPr>
+                <w:b w:val="false"/>
+                <w:bCs w:val="false"/>
+                <w:sz w:val="20"/>
+                <w:szCs w:val="20"/>
+              </w:rPr>
+              <w:t>Config</w:t>
+            </w:r>
+          </w:p>
+        </w:tc>
+        <w:tc>
+          <w:tcPr>
+            <w:tcW w:type="dxa" w:w="1100"/>
+            <w:tcBorders>
+              <w:top w:val="single" w:color="CCCCCC" w:sz="1"/>
+              <w:left w:val="single" w:color="CCCCCC" w:sz="1"/>
+              <w:bottom w:val="single" w:color="CCCCCC" w:sz="1"/>
+              <w:right w:val="single" w:color="CCCCCC" w:sz="1"/>
+            </w:tcBorders>
+            <w:shd w:fill="F2F2F2" w:val="clear"/>
+            <w:tcMar>
+              <w:top w:type="dxa" w:w="80"/>
+              <w:left w:type="dxa" w:w="120"/>
+              <w:bottom w:type="dxa" w:w="80"/>
+              <w:right w:type="dxa" w:w="120"/>
+            </w:tcMar>
+            <w:vAlign w:val="center"/>
+          </w:tcPr>
+          <w:p>
+            <w:pPr>
+              <w:jc w:val="left"/>
+            </w:pPr>
+            <w:r>
+              <w:rPr>
+                <w:b w:val="false"/>
+                <w:bCs w:val="false"/>
+                <w:sz w:val="20"/>
+                <w:szCs w:val="20"/>
+              </w:rPr>
+              <w:t>GET/PUT</w:t>
+            </w:r>
+          </w:p>
+        </w:tc>
+        <w:tc>
+          <w:tcPr>
+            <w:tcW w:type="dxa" w:w="2900"/>
+            <w:tcBorders>
+              <w:top w:val="single" w:color="CCCCCC" w:sz="1"/>
+              <w:left w:val="single" w:color="CCCCCC" w:sz="1"/>
+              <w:bottom w:val="single" w:color="CCCCCC" w:sz="1"/>
+              <w:right w:val="single" w:color="CCCCCC" w:sz="1"/>
+            </w:tcBorders>
+            <w:shd w:fill="F2F2F2" w:val="clear"/>
+            <w:tcMar>
+              <w:top w:type="dxa" w:w="80"/>
+              <w:left w:type="dxa" w:w="120"/>
+              <w:bottom w:type="dxa" w:w="80"/>
+              <w:right w:type="dxa" w:w="120"/>
+            </w:tcMar>
+            <w:vAlign w:val="center"/>
+          </w:tcPr>
+          <w:p>
+            <w:pPr>
+              <w:jc w:val="left"/>
+            </w:pPr>
+            <w:r>
+              <w:rPr>
+                <w:b w:val="false"/>
+                <w:bCs w:val="false"/>
+                <w:sz w:val="18"/>
+                <w:szCs w:val="18"/>
+              </w:rPr>
+              <w:t>/api/config</w:t>
+            </w:r>
+          </w:p>
+        </w:tc>
+        <w:tc>
+          <w:tcPr>
+            <w:tcW w:type="dxa" w:w="3326"/>
+            <w:tcBorders>
+              <w:top w:val="single" w:color="CCCCCC" w:sz="1"/>
+              <w:left w:val="single" w:color="CCCCCC" w:sz="1"/>
+              <w:bottom w:val="single" w:color="CCCCCC" w:sz="1"/>
+              <w:right w:val="single" w:color="CCCCCC" w:sz="1"/>
+            </w:tcBorders>
+            <w:shd w:fill="F2F2F2" w:val="clear"/>
+            <w:tcMar>
+              <w:top w:type="dxa" w:w="80"/>
+              <w:left w:type="dxa" w:w="120"/>
+              <w:bottom w:type="dxa" w:w="80"/>
+              <w:right w:type="dxa" w:w="120"/>
+            </w:tcMar>
+            <w:vAlign w:val="center"/>
+          </w:tcPr>
+          <w:p>
+            <w:pPr>
+              <w:jc w:val="left"/>
+            </w:pPr>
+            <w:r>
+              <w:rPr>
+                <w:b w:val="false"/>
+                <w:bCs w:val="false"/>
+                <w:sz w:val="20"/>
+                <w:szCs w:val="20"/>
+              </w:rPr>
+              <w:t>Parâmetros do sistema (ex.: dias para alerta de processo parado)</w:t>
+            </w:r>
+          </w:p>
+        </w:tc>
+      </w:tr>
+      <w:tr>
+        <w:tc>
+          <w:tcPr>
+            <w:tcW w:type="dxa" w:w="1700"/>
+            <w:tcBorders>
+              <w:top w:val="single" w:color="CCCCCC" w:sz="1"/>
+              <w:left w:val="single" w:color="CCCCCC" w:sz="1"/>
+              <w:bottom w:val="single" w:color="CCCCCC" w:sz="1"/>
+              <w:right w:val="single" w:color="CCCCCC" w:sz="1"/>
+            </w:tcBorders>
+            <w:shd w:fill="F2F2F2" w:val="clear"/>
+            <w:tcMar>
+              <w:top w:type="dxa" w:w="80"/>
+              <w:left w:type="dxa" w:w="120"/>
+              <w:bottom w:type="dxa" w:w="80"/>
+              <w:right w:type="dxa" w:w="120"/>
+            </w:tcMar>
+            <w:vAlign w:val="center"/>
+          </w:tcPr>
+          <w:p>
+            <w:pPr>
+              <w:jc w:val="left"/>
+            </w:pPr>
+            <w:r>
+              <w:rPr>
+                <w:b w:val="false"/>
+                <w:bCs w:val="false"/>
+                <w:sz w:val="20"/>
+                <w:szCs w:val="20"/>
+              </w:rPr>
+              <w:t>Autocomplete</w:t>
+            </w:r>
+          </w:p>
+        </w:tc>
+        <w:tc>
+          <w:tcPr>
+            <w:tcW w:type="dxa" w:w="1100"/>
+            <w:tcBorders>
+              <w:top w:val="single" w:color="CCCCCC" w:sz="1"/>
+              <w:left w:val="single" w:color="CCCCCC" w:sz="1"/>
+              <w:bottom w:val="single" w:color="CCCCCC" w:sz="1"/>
+              <w:right w:val="single" w:color="CCCCCC" w:sz="1"/>
+            </w:tcBorders>
+            <w:shd w:fill="F2F2F2" w:val="clear"/>
+            <w:tcMar>
+              <w:top w:type="dxa" w:w="80"/>
+              <w:left w:type="dxa" w:w="120"/>
+              <w:bottom w:type="dxa" w:w="80"/>
+              <w:right w:type="dxa" w:w="120"/>
+            </w:tcMar>
+            <w:vAlign w:val="center"/>
+          </w:tcPr>
+          <w:p>
+            <w:pPr>
+              <w:jc w:val="left"/>
+            </w:pPr>
+            <w:r>
+              <w:rPr>
+                <w:b w:val="false"/>
+                <w:bCs w:val="false"/>
+                <w:sz w:val="20"/>
+                <w:szCs w:val="20"/>
+              </w:rPr>
+              <w:t>GET</w:t>
+            </w:r>
+          </w:p>
+        </w:tc>
+        <w:tc>
+          <w:tcPr>
+            <w:tcW w:type="dxa" w:w="2900"/>
+            <w:tcBorders>
+              <w:top w:val="single" w:color="CCCCCC" w:sz="1"/>
+              <w:left w:val="single" w:color="CCCCCC" w:sz="1"/>
+              <w:bottom w:val="single" w:color="CCCCCC" w:sz="1"/>
+              <w:right w:val="single" w:color="CCCCCC" w:sz="1"/>
+            </w:tcBorders>
+            <w:shd w:fill="F2F2F2" w:val="clear"/>
+            <w:tcMar>
+              <w:top w:type="dxa" w:w="80"/>
+              <w:left w:type="dxa" w:w="120"/>
+              <w:bottom w:type="dxa" w:w="80"/>
+              <w:right w:type="dxa" w:w="120"/>
+            </w:tcMar>
+            <w:vAlign w:val="center"/>
+          </w:tcPr>
+          <w:p>
+            <w:pPr>
+              <w:jc w:val="left"/>
+            </w:pPr>
+            <w:r>
+              <w:rPr>
+                <w:b w:val="false"/>
+                <w:bCs w:val="false"/>
+                <w:sz w:val="18"/>
+                <w:szCs w:val="18"/>
+              </w:rPr>
+              <w:t>/api/autocomplete/:campo</w:t>
+            </w:r>
+          </w:p>
+        </w:tc>
+        <w:tc>
+          <w:tcPr>
+            <w:tcW w:type="dxa" w:w="3326"/>
+            <w:tcBorders>
+              <w:top w:val="single" w:color="CCCCCC" w:sz="1"/>
+              <w:left w:val="single" w:color="CCCCCC" w:sz="1"/>
+              <w:bottom w:val="single" w:color="CCCCCC" w:sz="1"/>
+              <w:right w:val="single" w:color="CCCCCC" w:sz="1"/>
+            </w:tcBorders>
+            <w:shd w:fill="F2F2F2" w:val="clear"/>
+            <w:tcMar>
+              <w:top w:type="dxa" w:w="80"/>
+              <w:left w:type="dxa" w:w="120"/>
+              <w:bottom w:type="dxa" w:w="80"/>
+              <w:right w:type="dxa" w:w="120"/>
+            </w:tcMar>
+            <w:vAlign w:val="center"/>
+          </w:tcPr>
+          <w:p>
+            <w:pPr>
+              <w:jc w:val="left"/>
+            </w:pPr>
+            <w:r>
+              <w:rPr>
+                <w:b w:val="false"/>
+                <w:bCs w:val="false"/>
+                <w:sz w:val="20"/>
+                <w:szCs w:val="20"/>
+              </w:rPr>
+              <w:t>Sugestões de preenchimento com base no histórico já digitado</w:t>
+            </w:r>
+          </w:p>
+        </w:tc>
+      </w:tr>
+      <w:tr>
+        <w:tc>
+          <w:tcPr>
+            <w:tcW w:type="dxa" w:w="1700"/>
+            <w:tcBorders>
+              <w:top w:val="single" w:color="CCCCCC" w:sz="1"/>
+              <w:left w:val="single" w:color="CCCCCC" w:sz="1"/>
+              <w:bottom w:val="single" w:color="CCCCCC" w:sz="1"/>
+              <w:right w:val="single" w:color="CCCCCC" w:sz="1"/>
+            </w:tcBorders>
+            <w:shd w:fill="F2F2F2" w:val="clear"/>
+            <w:tcMar>
+              <w:top w:type="dxa" w:w="80"/>
+              <w:left w:type="dxa" w:w="120"/>
+              <w:bottom w:type="dxa" w:w="80"/>
+              <w:right w:type="dxa" w:w="120"/>
+            </w:tcMar>
+            <w:vAlign w:val="center"/>
+          </w:tcPr>
+          <w:p>
+            <w:pPr>
+              <w:jc w:val="left"/>
+            </w:pPr>
+            <w:r>
+              <w:rPr>
+                <w:b w:val="false"/>
+                <w:bCs w:val="false"/>
+                <w:sz w:val="20"/>
+                <w:szCs w:val="20"/>
+              </w:rPr>
+              <w:t>Admin</w:t>
+            </w:r>
+          </w:p>
+        </w:tc>
+        <w:tc>
+          <w:tcPr>
+            <w:tcW w:type="dxa" w:w="1100"/>
+            <w:tcBorders>
+              <w:top w:val="single" w:color="CCCCCC" w:sz="1"/>
+              <w:left w:val="single" w:color="CCCCCC" w:sz="1"/>
+              <w:bottom w:val="single" w:color="CCCCCC" w:sz="1"/>
+              <w:right w:val="single" w:color="CCCCCC" w:sz="1"/>
+            </w:tcBorders>
+            <w:shd w:fill="F2F2F2" w:val="clear"/>
+            <w:tcMar>
+              <w:top w:type="dxa" w:w="80"/>
+              <w:left w:type="dxa" w:w="120"/>
+              <w:bottom w:type="dxa" w:w="80"/>
+              <w:right w:type="dxa" w:w="120"/>
+            </w:tcMar>
+            <w:vAlign w:val="center"/>
+          </w:tcPr>
+          <w:p>
+            <w:pPr>
+              <w:jc w:val="left"/>
+            </w:pPr>
+            <w:r>
+              <w:rPr>
+                <w:b w:val="false"/>
+                <w:bCs w:val="false"/>
+                <w:sz w:val="20"/>
+                <w:szCs w:val="20"/>
+              </w:rPr>
+              <w:t>GET/POST/PUT/DELETE</w:t>
+            </w:r>
+          </w:p>
+        </w:tc>
+        <w:tc>
+          <w:tcPr>
+            <w:tcW w:type="dxa" w:w="2900"/>
+            <w:tcBorders>
+              <w:top w:val="single" w:color="CCCCCC" w:sz="1"/>
+              <w:left w:val="single" w:color="CCCCCC" w:sz="1"/>
+              <w:bottom w:val="single" w:color="CCCCCC" w:sz="1"/>
+              <w:right w:val="single" w:color="CCCCCC" w:sz="1"/>
+            </w:tcBorders>
+            <w:shd w:fill="F2F2F2" w:val="clear"/>
+            <w:tcMar>
+              <w:top w:type="dxa" w:w="80"/>
+              <w:left w:type="dxa" w:w="120"/>
+              <w:bottom w:type="dxa" w:w="80"/>
+              <w:right w:type="dxa" w:w="120"/>
+            </w:tcMar>
+            <w:vAlign w:val="center"/>
+          </w:tcPr>
+          <w:p>
+            <w:pPr>
+              <w:jc w:val="left"/>
+            </w:pPr>
+            <w:r>
+              <w:rPr>
+                <w:b w:val="false"/>
+                <w:bCs w:val="false"/>
+                <w:sz w:val="18"/>
+                <w:szCs w:val="18"/>
+              </w:rPr>
+              <w:t>/api/admin/users(/:id)</w:t>
+            </w:r>
+          </w:p>
+        </w:tc>
+        <w:tc>
+          <w:tcPr>
+            <w:tcW w:type="dxa" w:w="3326"/>
+            <w:tcBorders>
+              <w:top w:val="single" w:color="CCCCCC" w:sz="1"/>
+              <w:left w:val="single" w:color="CCCCCC" w:sz="1"/>
+              <w:bottom w:val="single" w:color="CCCCCC" w:sz="1"/>
+              <w:right w:val="single" w:color="CCCCCC" w:sz="1"/>
+            </w:tcBorders>
+            <w:shd w:fill="F2F2F2" w:val="clear"/>
+            <w:tcMar>
+              <w:top w:type="dxa" w:w="80"/>
+              <w:left w:type="dxa" w:w="120"/>
+              <w:bottom w:type="dxa" w:w="80"/>
+              <w:right w:type="dxa" w:w="120"/>
+            </w:tcMar>
+            <w:vAlign w:val="center"/>
+          </w:tcPr>
+          <w:p>
+            <w:pPr>
+              <w:jc w:val="left"/>
+            </w:pPr>
+            <w:r>
+              <w:rPr>
+                <w:b w:val="false"/>
+                <w:bCs w:val="false"/>
+                <w:sz w:val="20"/>
+                <w:szCs w:val="20"/>
+              </w:rPr>
+              <w:t>Gestão de usuários (criação, ativação, troca de senha, role)</w:t>
+            </w:r>
+          </w:p>
+        </w:tc>
+      </w:tr>
+      <w:tr>
+        <w:tc>
+          <w:tcPr>
+            <w:tcW w:type="dxa" w:w="1700"/>
+            <w:tcBorders>
+              <w:top w:val="single" w:color="CCCCCC" w:sz="1"/>
+              <w:left w:val="single" w:color="CCCCCC" w:sz="1"/>
+              <w:bottom w:val="single" w:color="CCCCCC" w:sz="1"/>
+              <w:right w:val="single" w:color="CCCCCC" w:sz="1"/>
+            </w:tcBorders>
+            <w:shd w:fill="F2F2F2" w:val="clear"/>
+            <w:tcMar>
+              <w:top w:type="dxa" w:w="80"/>
+              <w:left w:type="dxa" w:w="120"/>
+              <w:bottom w:type="dxa" w:w="80"/>
+              <w:right w:type="dxa" w:w="120"/>
+            </w:tcMar>
+            <w:vAlign w:val="center"/>
+          </w:tcPr>
+          <w:p>
+            <w:pPr>
+              <w:jc w:val="left"/>
+            </w:pPr>
+            <w:r>
+              <w:rPr>
+                <w:b w:val="false"/>
+                <w:bCs w:val="false"/>
+                <w:sz w:val="20"/>
+                <w:szCs w:val="20"/>
+              </w:rPr>
+              <w:t>Sistema</w:t>
+            </w:r>
+          </w:p>
+        </w:tc>
+        <w:tc>
+          <w:tcPr>
+            <w:tcW w:type="dxa" w:w="1100"/>
+            <w:tcBorders>
+              <w:top w:val="single" w:color="CCCCCC" w:sz="1"/>
+              <w:left w:val="single" w:color="CCCCCC" w:sz="1"/>
+              <w:bottom w:val="single" w:color="CCCCCC" w:sz="1"/>
+              <w:right w:val="single" w:color="CCCCCC" w:sz="1"/>
+            </w:tcBorders>
+            <w:shd w:fill="F2F2F2" w:val="clear"/>
+            <w:tcMar>
+              <w:top w:type="dxa" w:w="80"/>
+              <w:left w:type="dxa" w:w="120"/>
+              <w:bottom w:type="dxa" w:w="80"/>
+              <w:right w:type="dxa" w:w="120"/>
+            </w:tcMar>
+            <w:vAlign w:val="center"/>
+          </w:tcPr>
+          <w:p>
+            <w:pPr>
+              <w:jc w:val="left"/>
+            </w:pPr>
+            <w:r>
+              <w:rPr>
+                <w:b w:val="false"/>
+                <w:bCs w:val="false"/>
+                <w:sz w:val="20"/>
+                <w:szCs w:val="20"/>
+              </w:rPr>
+              <w:t>GET</w:t>
+            </w:r>
+          </w:p>
+        </w:tc>
+        <w:tc>
+          <w:tcPr>
+            <w:tcW w:type="dxa" w:w="2900"/>
+            <w:tcBorders>
+              <w:top w:val="single" w:color="CCCCCC" w:sz="1"/>
+              <w:left w:val="single" w:color="CCCCCC" w:sz="1"/>
+              <w:bottom w:val="single" w:color="CCCCCC" w:sz="1"/>
+              <w:right w:val="single" w:color="CCCCCC" w:sz="1"/>
+            </w:tcBorders>
+            <w:shd w:fill="F2F2F2" w:val="clear"/>
+            <w:tcMar>
+              <w:top w:type="dxa" w:w="80"/>
+              <w:left w:type="dxa" w:w="120"/>
+              <w:bottom w:type="dxa" w:w="80"/>
+              <w:right w:type="dxa" w:w="120"/>
+            </w:tcMar>
+            <w:vAlign w:val="center"/>
+          </w:tcPr>
+          <w:p>
+            <w:pPr>
+              <w:jc w:val="left"/>
+            </w:pPr>
+            <w:r>
+              <w:rPr>
+                <w:b w:val="false"/>
+                <w:bCs w:val="false"/>
+                <w:sz w:val="18"/>
+                <w:szCs w:val="18"/>
+              </w:rPr>
+              <w:t>/api/version</w:t>
+            </w:r>
+          </w:p>
+        </w:tc>
+        <w:tc>
+          <w:tcPr>
+            <w:tcW w:type="dxa" w:w="3326"/>
+            <w:tcBorders>
+              <w:top w:val="single" w:color="CCCCCC" w:sz="1"/>
+              <w:left w:val="single" w:color="CCCCCC" w:sz="1"/>
+              <w:bottom w:val="single" w:color="CCCCCC" w:sz="1"/>
+              <w:right w:val="single" w:color="CCCCCC" w:sz="1"/>
+            </w:tcBorders>
+            <w:shd w:fill="F2F2F2" w:val="clear"/>
+            <w:tcMar>
+              <w:top w:type="dxa" w:w="80"/>
+              <w:left w:type="dxa" w:w="120"/>
+              <w:bottom w:type="dxa" w:w="80"/>
+              <w:right w:type="dxa" w:w="120"/>
+            </w:tcMar>
+            <w:vAlign w:val="center"/>
+          </w:tcPr>
+          <w:p>
+            <w:pPr>
+              <w:jc w:val="left"/>
+            </w:pPr>
+            <w:r>
+              <w:rPr>
+                <w:b w:val="false"/>
+                <w:bCs w:val="false"/>
+                <w:sz w:val="20"/>
+                <w:szCs w:val="20"/>
+              </w:rPr>
+              <w:t>Versão da aplicação (lida do package.json), exibida na barra lateral</w:t>
+            </w:r>
+          </w:p>
+        </w:tc>
+      </w:tr>
     </w:tbl>
     <w:p>
       <w:pPr>
@@ -4516,7 +5337,7 @@
                 <w:sz w:val="20"/>
                 <w:szCs w:val="20"/>
               </w:rPr>
-              <w:t xml:space="preserve">Administração de usuários, banco de dados e logs de auditoria (3 abas)</w:t>
+              <w:t>Administração de usuários, tipos de contratação, itens extras, parâmetros, banco de dados e logs de auditoria (6 abas, acesso restrito a administradores)</w:t>
             </w:r>
           </w:p>
         </w:tc>
@@ -4548,7 +5369,7 @@
         <w:spacing w:after="160"/>
       </w:pPr>
       <w:r>
-        <w:t xml:space="preserve">O esquema relacional do sistema é composto por sete tabelas principais, conforme o diagrama lógico a seguir:</w:t>
+        <w:t>O esquema relacional do sistema é composto por doze tabelas principais (processos, fornecedores, itens, precos, status, status_historico, users, sessions, logs, config, tipos_contratacao e tipos_extra), conforme o diagrama lógico a seguir:</w:t>
       </w:r>
     </w:p>
     <w:p>
@@ -6232,6 +7053,398 @@
           </w:p>
         </w:tc>
       </w:tr>
+      <w:tr>
+        <w:tc>
+          <w:tcPr>
+            <w:tcW w:type="dxa" w:w="2200"/>
+            <w:tcBorders>
+              <w:top w:val="single" w:color="CCCCCC" w:sz="1"/>
+              <w:left w:val="single" w:color="CCCCCC" w:sz="1"/>
+              <w:bottom w:val="single" w:color="CCCCCC" w:sz="1"/>
+              <w:right w:val="single" w:color="CCCCCC" w:sz="1"/>
+            </w:tcBorders>
+            <w:tcMar>
+              <w:top w:type="dxa" w:w="80"/>
+              <w:left w:type="dxa" w:w="120"/>
+              <w:bottom w:type="dxa" w:w="80"/>
+              <w:right w:type="dxa" w:w="120"/>
+            </w:tcMar>
+            <w:vAlign w:val="center"/>
+          </w:tcPr>
+          <w:p>
+            <w:pPr>
+              <w:jc w:val="left"/>
+            </w:pPr>
+            <w:r>
+              <w:rPr>
+                <w:b w:val="false"/>
+                <w:bCs w:val="false"/>
+                <w:sz w:val="20"/>
+                <w:szCs w:val="20"/>
+              </w:rPr>
+              <w:t>frete_termo</w:t>
+            </w:r>
+          </w:p>
+        </w:tc>
+        <w:tc>
+          <w:tcPr>
+            <w:tcW w:type="dxa" w:w="1500"/>
+            <w:tcBorders>
+              <w:top w:val="single" w:color="CCCCCC" w:sz="1"/>
+              <w:left w:val="single" w:color="CCCCCC" w:sz="1"/>
+              <w:bottom w:val="single" w:color="CCCCCC" w:sz="1"/>
+              <w:right w:val="single" w:color="CCCCCC" w:sz="1"/>
+            </w:tcBorders>
+            <w:tcMar>
+              <w:top w:type="dxa" w:w="80"/>
+              <w:left w:type="dxa" w:w="120"/>
+              <w:bottom w:type="dxa" w:w="80"/>
+              <w:right w:type="dxa" w:w="120"/>
+            </w:tcMar>
+            <w:vAlign w:val="center"/>
+          </w:tcPr>
+          <w:p>
+            <w:pPr>
+              <w:jc w:val="left"/>
+            </w:pPr>
+            <w:r>
+              <w:rPr>
+                <w:b w:val="false"/>
+                <w:bCs w:val="false"/>
+                <w:sz w:val="20"/>
+                <w:szCs w:val="20"/>
+              </w:rPr>
+              <w:t>TEXT</w:t>
+            </w:r>
+          </w:p>
+        </w:tc>
+        <w:tc>
+          <w:tcPr>
+            <w:tcW w:type="dxa" w:w="5326"/>
+            <w:tcBorders>
+              <w:top w:val="single" w:color="CCCCCC" w:sz="1"/>
+              <w:left w:val="single" w:color="CCCCCC" w:sz="1"/>
+              <w:bottom w:val="single" w:color="CCCCCC" w:sz="1"/>
+              <w:right w:val="single" w:color="CCCCCC" w:sz="1"/>
+            </w:tcBorders>
+            <w:tcMar>
+              <w:top w:type="dxa" w:w="80"/>
+              <w:left w:type="dxa" w:w="120"/>
+              <w:bottom w:type="dxa" w:w="80"/>
+              <w:right w:type="dxa" w:w="120"/>
+            </w:tcMar>
+            <w:vAlign w:val="center"/>
+          </w:tcPr>
+          <w:p>
+            <w:pPr>
+              <w:jc w:val="left"/>
+            </w:pPr>
+            <w:r>
+              <w:rPr>
+                <w:b w:val="false"/>
+                <w:bCs w:val="false"/>
+                <w:sz w:val="20"/>
+                <w:szCs w:val="20"/>
+              </w:rPr>
+              <w:t>Termo do frete (CIF ou FOB), independente do campo frete</w:t>
+            </w:r>
+          </w:p>
+        </w:tc>
+      </w:tr>
+      <w:tr>
+        <w:tc>
+          <w:tcPr>
+            <w:tcW w:type="dxa" w:w="2200"/>
+            <w:tcBorders>
+              <w:top w:val="single" w:color="CCCCCC" w:sz="1"/>
+              <w:left w:val="single" w:color="CCCCCC" w:sz="1"/>
+              <w:bottom w:val="single" w:color="CCCCCC" w:sz="1"/>
+              <w:right w:val="single" w:color="CCCCCC" w:sz="1"/>
+            </w:tcBorders>
+            <w:tcMar>
+              <w:top w:type="dxa" w:w="80"/>
+              <w:left w:type="dxa" w:w="120"/>
+              <w:bottom w:type="dxa" w:w="80"/>
+              <w:right w:type="dxa" w:w="120"/>
+            </w:tcMar>
+            <w:vAlign w:val="center"/>
+          </w:tcPr>
+          <w:p>
+            <w:pPr>
+              <w:jc w:val="left"/>
+            </w:pPr>
+            <w:r>
+              <w:rPr>
+                <w:b w:val="false"/>
+                <w:bCs w:val="false"/>
+                <w:sz w:val="20"/>
+                <w:szCs w:val="20"/>
+              </w:rPr>
+              <w:t>declinio</w:t>
+            </w:r>
+          </w:p>
+        </w:tc>
+        <w:tc>
+          <w:tcPr>
+            <w:tcW w:type="dxa" w:w="1500"/>
+            <w:tcBorders>
+              <w:top w:val="single" w:color="CCCCCC" w:sz="1"/>
+              <w:left w:val="single" w:color="CCCCCC" w:sz="1"/>
+              <w:bottom w:val="single" w:color="CCCCCC" w:sz="1"/>
+              <w:right w:val="single" w:color="CCCCCC" w:sz="1"/>
+            </w:tcBorders>
+            <w:tcMar>
+              <w:top w:type="dxa" w:w="80"/>
+              <w:left w:type="dxa" w:w="120"/>
+              <w:bottom w:type="dxa" w:w="80"/>
+              <w:right w:type="dxa" w:w="120"/>
+            </w:tcMar>
+            <w:vAlign w:val="center"/>
+          </w:tcPr>
+          <w:p>
+            <w:pPr>
+              <w:jc w:val="left"/>
+            </w:pPr>
+            <w:r>
+              <w:rPr>
+                <w:b w:val="false"/>
+                <w:bCs w:val="false"/>
+                <w:sz w:val="20"/>
+                <w:szCs w:val="20"/>
+              </w:rPr>
+              <w:t>INTEGER</w:t>
+            </w:r>
+          </w:p>
+        </w:tc>
+        <w:tc>
+          <w:tcPr>
+            <w:tcW w:type="dxa" w:w="5326"/>
+            <w:tcBorders>
+              <w:top w:val="single" w:color="CCCCCC" w:sz="1"/>
+              <w:left w:val="single" w:color="CCCCCC" w:sz="1"/>
+              <w:bottom w:val="single" w:color="CCCCCC" w:sz="1"/>
+              <w:right w:val="single" w:color="CCCCCC" w:sz="1"/>
+            </w:tcBorders>
+            <w:tcMar>
+              <w:top w:type="dxa" w:w="80"/>
+              <w:left w:type="dxa" w:w="120"/>
+              <w:bottom w:type="dxa" w:w="80"/>
+              <w:right w:type="dxa" w:w="120"/>
+            </w:tcMar>
+            <w:vAlign w:val="center"/>
+          </w:tcPr>
+          <w:p>
+            <w:pPr>
+              <w:jc w:val="left"/>
+            </w:pPr>
+            <w:r>
+              <w:rPr>
+                <w:b w:val="false"/>
+                <w:bCs w:val="false"/>
+                <w:sz w:val="20"/>
+                <w:szCs w:val="20"/>
+              </w:rPr>
+              <w:t>Fornecedor declinou da cotação (0 ou 1)</w:t>
+            </w:r>
+          </w:p>
+        </w:tc>
+      </w:tr>
+      <w:tr>
+        <w:tc>
+          <w:tcPr>
+            <w:tcW w:type="dxa" w:w="2200"/>
+            <w:tcBorders>
+              <w:top w:val="single" w:color="CCCCCC" w:sz="1"/>
+              <w:left w:val="single" w:color="CCCCCC" w:sz="1"/>
+              <w:bottom w:val="single" w:color="CCCCCC" w:sz="1"/>
+              <w:right w:val="single" w:color="CCCCCC" w:sz="1"/>
+            </w:tcBorders>
+            <w:tcMar>
+              <w:top w:type="dxa" w:w="80"/>
+              <w:left w:type="dxa" w:w="120"/>
+              <w:bottom w:type="dxa" w:w="80"/>
+              <w:right w:type="dxa" w:w="120"/>
+            </w:tcMar>
+            <w:vAlign w:val="center"/>
+          </w:tcPr>
+          <w:p>
+            <w:pPr>
+              <w:jc w:val="left"/>
+            </w:pPr>
+            <w:r>
+              <w:rPr>
+                <w:b w:val="false"/>
+                <w:bCs w:val="false"/>
+                <w:sz w:val="20"/>
+                <w:szCs w:val="20"/>
+              </w:rPr>
+              <w:t>pesquisa_internet</w:t>
+            </w:r>
+          </w:p>
+        </w:tc>
+        <w:tc>
+          <w:tcPr>
+            <w:tcW w:type="dxa" w:w="1500"/>
+            <w:tcBorders>
+              <w:top w:val="single" w:color="CCCCCC" w:sz="1"/>
+              <w:left w:val="single" w:color="CCCCCC" w:sz="1"/>
+              <w:bottom w:val="single" w:color="CCCCCC" w:sz="1"/>
+              <w:right w:val="single" w:color="CCCCCC" w:sz="1"/>
+            </w:tcBorders>
+            <w:tcMar>
+              <w:top w:type="dxa" w:w="80"/>
+              <w:left w:type="dxa" w:w="120"/>
+              <w:bottom w:type="dxa" w:w="80"/>
+              <w:right w:type="dxa" w:w="120"/>
+            </w:tcMar>
+            <w:vAlign w:val="center"/>
+          </w:tcPr>
+          <w:p>
+            <w:pPr>
+              <w:jc w:val="left"/>
+            </w:pPr>
+            <w:r>
+              <w:rPr>
+                <w:b w:val="false"/>
+                <w:bCs w:val="false"/>
+                <w:sz w:val="20"/>
+                <w:szCs w:val="20"/>
+              </w:rPr>
+              <w:t>INTEGER</w:t>
+            </w:r>
+          </w:p>
+        </w:tc>
+        <w:tc>
+          <w:tcPr>
+            <w:tcW w:type="dxa" w:w="5326"/>
+            <w:tcBorders>
+              <w:top w:val="single" w:color="CCCCCC" w:sz="1"/>
+              <w:left w:val="single" w:color="CCCCCC" w:sz="1"/>
+              <w:bottom w:val="single" w:color="CCCCCC" w:sz="1"/>
+              <w:right w:val="single" w:color="CCCCCC" w:sz="1"/>
+            </w:tcBorders>
+            <w:tcMar>
+              <w:top w:type="dxa" w:w="80"/>
+              <w:left w:type="dxa" w:w="120"/>
+              <w:bottom w:type="dxa" w:w="80"/>
+              <w:right w:type="dxa" w:w="120"/>
+            </w:tcMar>
+            <w:vAlign w:val="center"/>
+          </w:tcPr>
+          <w:p>
+            <w:pPr>
+              <w:jc w:val="left"/>
+            </w:pPr>
+            <w:r>
+              <w:rPr>
+                <w:b w:val="false"/>
+                <w:bCs w:val="false"/>
+                <w:sz w:val="20"/>
+                <w:szCs w:val="20"/>
+              </w:rPr>
+              <w:t>Cotação obtida via pesquisa na internet, sem contato direto (0 ou 1)</w:t>
+            </w:r>
+          </w:p>
+        </w:tc>
+      </w:tr>
+      <w:tr>
+        <w:tc>
+          <w:tcPr>
+            <w:tcW w:type="dxa" w:w="2200"/>
+            <w:tcBorders>
+              <w:top w:val="single" w:color="CCCCCC" w:sz="1"/>
+              <w:left w:val="single" w:color="CCCCCC" w:sz="1"/>
+              <w:bottom w:val="single" w:color="CCCCCC" w:sz="1"/>
+              <w:right w:val="single" w:color="CCCCCC" w:sz="1"/>
+            </w:tcBorders>
+            <w:tcMar>
+              <w:top w:type="dxa" w:w="80"/>
+              <w:left w:type="dxa" w:w="120"/>
+              <w:bottom w:type="dxa" w:w="80"/>
+              <w:right w:type="dxa" w:w="120"/>
+            </w:tcMar>
+            <w:vAlign w:val="center"/>
+          </w:tcPr>
+          <w:p>
+            <w:pPr>
+              <w:jc w:val="left"/>
+            </w:pPr>
+            <w:r>
+              <w:rPr>
+                <w:b w:val="false"/>
+                <w:bCs w:val="false"/>
+                <w:sz w:val="20"/>
+                <w:szCs w:val="20"/>
+              </w:rPr>
+              <w:t>pesquisa_compra_publica</w:t>
+            </w:r>
+          </w:p>
+        </w:tc>
+        <w:tc>
+          <w:tcPr>
+            <w:tcW w:type="dxa" w:w="1500"/>
+            <w:tcBorders>
+              <w:top w:val="single" w:color="CCCCCC" w:sz="1"/>
+              <w:left w:val="single" w:color="CCCCCC" w:sz="1"/>
+              <w:bottom w:val="single" w:color="CCCCCC" w:sz="1"/>
+              <w:right w:val="single" w:color="CCCCCC" w:sz="1"/>
+            </w:tcBorders>
+            <w:tcMar>
+              <w:top w:type="dxa" w:w="80"/>
+              <w:left w:type="dxa" w:w="120"/>
+              <w:bottom w:type="dxa" w:w="80"/>
+              <w:right w:type="dxa" w:w="120"/>
+            </w:tcMar>
+            <w:vAlign w:val="center"/>
+          </w:tcPr>
+          <w:p>
+            <w:pPr>
+              <w:jc w:val="left"/>
+            </w:pPr>
+            <w:r>
+              <w:rPr>
+                <w:b w:val="false"/>
+                <w:bCs w:val="false"/>
+                <w:sz w:val="20"/>
+                <w:szCs w:val="20"/>
+              </w:rPr>
+              <w:t>INTEGER</w:t>
+            </w:r>
+          </w:p>
+        </w:tc>
+        <w:tc>
+          <w:tcPr>
+            <w:tcW w:type="dxa" w:w="5326"/>
+            <w:tcBorders>
+              <w:top w:val="single" w:color="CCCCCC" w:sz="1"/>
+              <w:left w:val="single" w:color="CCCCCC" w:sz="1"/>
+              <w:bottom w:val="single" w:color="CCCCCC" w:sz="1"/>
+              <w:right w:val="single" w:color="CCCCCC" w:sz="1"/>
+            </w:tcBorders>
+            <w:tcMar>
+              <w:top w:type="dxa" w:w="80"/>
+              <w:left w:type="dxa" w:w="120"/>
+              <w:bottom w:type="dxa" w:w="80"/>
+              <w:right w:type="dxa" w:w="120"/>
+            </w:tcMar>
+            <w:vAlign w:val="center"/>
+          </w:tcPr>
+          <w:p>
+            <w:pPr>
+              <w:jc w:val="left"/>
+            </w:pPr>
+            <w:r>
+              <w:rPr>
+                <w:b w:val="false"/>
+                <w:bCs w:val="false"/>
+                <w:sz w:val="20"/>
+                <w:szCs w:val="20"/>
+              </w:rPr>
+              <w:t>Cotação obtida via Portal Nacional de Compras Públicas (0 ou 1)</w:t>
+            </w:r>
+          </w:p>
+        </w:tc>
+      </w:tr>
     </w:tbl>
     <w:p>
       <w:pPr>
@@ -6251,7 +7464,7 @@
         <w:spacing w:after="160"/>
       </w:pPr>
       <w:r>
-        <w:t xml:space="preserve">Complementam o modelo as tabelas itens (itens do processo), precos (relação N:N entre itens e fornecedores, com unicidade da combinação item_id/fornecedor_id), status (catálogo de situações do processo), status_historico (auditoria de mudanças de status), users (usuários do sistema, com hash de senha), logs (auditoria de ações do sistema, com tipo, ação, descrição, IP e usuário) e sessions (sessões ativas, com expiração de 8 horas).</w:t>
+        <w:t>Complementam o modelo as tabelas itens (itens do processo, com flag extra para linhas ad-hoc de preço criadas na tela do fornecedor), precos (relação N:N entre itens e fornecedores, com unicidade da combinação item_id/fornecedor_id), status (catálogo de situações do processo), status_historico (auditoria de mudanças de status), users (usuários do sistema, com hash de senha e role admin/usuario_comum), logs (auditoria de ações do sistema, com tipo, ação, descrição, IP e usuário), config (parâmetros do sistema, como o limite de dias para alerta de processo parado), tipos_contratacao (catálogo gerenciável de tipos de contratação) e tipos_extra (catálogo de linhas extras de preço, com unidade, descrição, sinal positivo/negativo e tipo de valor fixo em R$ ou percentual) e sessions (sessões ativas, com expiração de 8 horas).</w:t>
       </w:r>
     </w:p>
     <w:p>
@@ -6366,6 +7579,24 @@
       <w:r>
         <w:t xml:space="preserve">não pode ser excluído, desativado ou ter o nome de usuário alterado; não é exibido na listagem padrão.</w:t>
       </w:r>
+    </w:p>
+    <w:p>
+      <w:pPr>
+        <w:pStyle w:val="ListParagraph"/>
+        <w:numPr>
+          <w:ilvl w:val="0"/>
+          <w:numId w:val="2"/>
+        </w:numPr>
+        <w:spacing w:after="80"/>
+      </w:pPr>
+      <w:r>
+        <w:rPr>
+          <w:b/>
+          <w:bCs/>
+        </w:rPr>
+        <w:t>Perfis de acesso: cada usuário tem role admin ou usuario_comum. Administradores têm acesso total (inclusive a admin.html) e podem editar qualquer processo; usuários comuns visualizam todos os processos mas só podem editar os que criaram (middleware requireAdmin e requireEditProcesso, com checagem de processos.criado_por_id).</w:t>
+      </w:r>
+      <w:r/>
     </w:p>
     <w:p>
       <w:pPr>
@@ -7470,6 +8701,600 @@
           </w:p>
         </w:tc>
       </w:tr>
+      <w:tr>
+        <w:tc>
+          <w:tcPr>
+            <w:tcW w:type="dxa" w:w="4513"/>
+            <w:tcBorders>
+              <w:top w:val="single" w:color="CCCCCC" w:sz="1"/>
+              <w:left w:val="single" w:color="CCCCCC" w:sz="1"/>
+              <w:bottom w:val="single" w:color="CCCCCC" w:sz="1"/>
+              <w:right w:val="single" w:color="CCCCCC" w:sz="1"/>
+            </w:tcBorders>
+            <w:tcMar>
+              <w:top w:type="dxa" w:w="80"/>
+              <w:left w:type="dxa" w:w="120"/>
+              <w:bottom w:type="dxa" w:w="80"/>
+              <w:right w:type="dxa" w:w="120"/>
+            </w:tcMar>
+            <w:vAlign w:val="center"/>
+          </w:tcPr>
+          <w:p>
+            <w:pPr>
+              <w:jc w:val="left"/>
+            </w:pPr>
+            <w:r>
+              <w:rPr>
+                <w:b w:val="false"/>
+                <w:bCs w:val="false"/>
+                <w:sz w:val="20"/>
+                <w:szCs w:val="20"/>
+              </w:rPr>
+              <w:t>Sistema de permissões por perfil (Admin / Usuário comum), com edição restrita ao criador do processo</w:t>
+            </w:r>
+          </w:p>
+        </w:tc>
+        <w:tc>
+          <w:tcPr>
+            <w:tcW w:type="dxa" w:w="4513"/>
+            <w:tcBorders>
+              <w:top w:val="single" w:color="CCCCCC" w:sz="1"/>
+              <w:left w:val="single" w:color="CCCCCC" w:sz="1"/>
+              <w:bottom w:val="single" w:color="CCCCCC" w:sz="1"/>
+              <w:right w:val="single" w:color="CCCCCC" w:sz="1"/>
+            </w:tcBorders>
+            <w:tcMar>
+              <w:top w:type="dxa" w:w="80"/>
+              <w:left w:type="dxa" w:w="120"/>
+              <w:bottom w:type="dxa" w:w="80"/>
+              <w:right w:type="dxa" w:w="120"/>
+            </w:tcMar>
+            <w:vAlign w:val="center"/>
+          </w:tcPr>
+          <w:p>
+            <w:pPr>
+              <w:jc w:val="left"/>
+            </w:pPr>
+            <w:r>
+              <w:rPr>
+                <w:b w:val="false"/>
+                <w:bCs w:val="false"/>
+                <w:sz w:val="20"/>
+                <w:szCs w:val="20"/>
+              </w:rPr>
+              <w:t>Implementado</w:t>
+            </w:r>
+          </w:p>
+        </w:tc>
+      </w:tr>
+      <w:tr>
+        <w:tc>
+          <w:tcPr>
+            <w:tcW w:type="dxa" w:w="4513"/>
+            <w:tcBorders>
+              <w:top w:val="single" w:color="CCCCCC" w:sz="1"/>
+              <w:left w:val="single" w:color="CCCCCC" w:sz="1"/>
+              <w:bottom w:val="single" w:color="CCCCCC" w:sz="1"/>
+              <w:right w:val="single" w:color="CCCCCC" w:sz="1"/>
+            </w:tcBorders>
+            <w:tcMar>
+              <w:top w:type="dxa" w:w="80"/>
+              <w:left w:type="dxa" w:w="120"/>
+              <w:bottom w:type="dxa" w:w="80"/>
+              <w:right w:type="dxa" w:w="120"/>
+            </w:tcMar>
+            <w:vAlign w:val="center"/>
+          </w:tcPr>
+          <w:p>
+            <w:pPr>
+              <w:jc w:val="left"/>
+            </w:pPr>
+            <w:r>
+              <w:rPr>
+                <w:b w:val="false"/>
+                <w:bCs w:val="false"/>
+                <w:sz w:val="20"/>
+                <w:szCs w:val="20"/>
+              </w:rPr>
+              <w:t>Flags de fornecedor — Declínio, Pesquisa Internet, Pesquisa Compra Pública — mutuamente exclusivas, movem o fornecedor para o fim da fila de comparação</w:t>
+            </w:r>
+          </w:p>
+        </w:tc>
+        <w:tc>
+          <w:tcPr>
+            <w:tcW w:type="dxa" w:w="4513"/>
+            <w:tcBorders>
+              <w:top w:val="single" w:color="CCCCCC" w:sz="1"/>
+              <w:left w:val="single" w:color="CCCCCC" w:sz="1"/>
+              <w:bottom w:val="single" w:color="CCCCCC" w:sz="1"/>
+              <w:right w:val="single" w:color="CCCCCC" w:sz="1"/>
+            </w:tcBorders>
+            <w:tcMar>
+              <w:top w:type="dxa" w:w="80"/>
+              <w:left w:type="dxa" w:w="120"/>
+              <w:bottom w:type="dxa" w:w="80"/>
+              <w:right w:type="dxa" w:w="120"/>
+            </w:tcMar>
+            <w:vAlign w:val="center"/>
+          </w:tcPr>
+          <w:p>
+            <w:pPr>
+              <w:jc w:val="left"/>
+            </w:pPr>
+            <w:r>
+              <w:rPr>
+                <w:b w:val="false"/>
+                <w:bCs w:val="false"/>
+                <w:sz w:val="20"/>
+                <w:szCs w:val="20"/>
+              </w:rPr>
+              <w:t>Implementado</w:t>
+            </w:r>
+          </w:p>
+        </w:tc>
+      </w:tr>
+      <w:tr>
+        <w:tc>
+          <w:tcPr>
+            <w:tcW w:type="dxa" w:w="4513"/>
+            <w:tcBorders>
+              <w:top w:val="single" w:color="CCCCCC" w:sz="1"/>
+              <w:left w:val="single" w:color="CCCCCC" w:sz="1"/>
+              <w:bottom w:val="single" w:color="CCCCCC" w:sz="1"/>
+              <w:right w:val="single" w:color="CCCCCC" w:sz="1"/>
+            </w:tcBorders>
+            <w:tcMar>
+              <w:top w:type="dxa" w:w="80"/>
+              <w:left w:type="dxa" w:w="120"/>
+              <w:bottom w:type="dxa" w:w="80"/>
+              <w:right w:type="dxa" w:w="120"/>
+            </w:tcMar>
+            <w:vAlign w:val="center"/>
+          </w:tcPr>
+          <w:p>
+            <w:pPr>
+              <w:jc w:val="left"/>
+            </w:pPr>
+            <w:r>
+              <w:rPr>
+                <w:b w:val="false"/>
+                <w:bCs w:val="false"/>
+                <w:sz w:val="20"/>
+                <w:szCs w:val="20"/>
+              </w:rPr>
+              <w:t>Progressive Web App (PWA) — instalável no dispositivo, com service worker (estratégia network-first)</w:t>
+            </w:r>
+          </w:p>
+        </w:tc>
+        <w:tc>
+          <w:tcPr>
+            <w:tcW w:type="dxa" w:w="4513"/>
+            <w:tcBorders>
+              <w:top w:val="single" w:color="CCCCCC" w:sz="1"/>
+              <w:left w:val="single" w:color="CCCCCC" w:sz="1"/>
+              <w:bottom w:val="single" w:color="CCCCCC" w:sz="1"/>
+              <w:right w:val="single" w:color="CCCCCC" w:sz="1"/>
+            </w:tcBorders>
+            <w:tcMar>
+              <w:top w:type="dxa" w:w="80"/>
+              <w:left w:type="dxa" w:w="120"/>
+              <w:bottom w:type="dxa" w:w="80"/>
+              <w:right w:type="dxa" w:w="120"/>
+            </w:tcMar>
+            <w:vAlign w:val="center"/>
+          </w:tcPr>
+          <w:p>
+            <w:pPr>
+              <w:jc w:val="left"/>
+            </w:pPr>
+            <w:r>
+              <w:rPr>
+                <w:b w:val="false"/>
+                <w:bCs w:val="false"/>
+                <w:sz w:val="20"/>
+                <w:szCs w:val="20"/>
+              </w:rPr>
+              <w:t>Implementado</w:t>
+            </w:r>
+          </w:p>
+        </w:tc>
+      </w:tr>
+      <w:tr>
+        <w:tc>
+          <w:tcPr>
+            <w:tcW w:type="dxa" w:w="4513"/>
+            <w:tcBorders>
+              <w:top w:val="single" w:color="CCCCCC" w:sz="1"/>
+              <w:left w:val="single" w:color="CCCCCC" w:sz="1"/>
+              <w:bottom w:val="single" w:color="CCCCCC" w:sz="1"/>
+              <w:right w:val="single" w:color="CCCCCC" w:sz="1"/>
+            </w:tcBorders>
+            <w:tcMar>
+              <w:top w:type="dxa" w:w="80"/>
+              <w:left w:type="dxa" w:w="120"/>
+              <w:bottom w:type="dxa" w:w="80"/>
+              <w:right w:type="dxa" w:w="120"/>
+            </w:tcMar>
+            <w:vAlign w:val="center"/>
+          </w:tcPr>
+          <w:p>
+            <w:pPr>
+              <w:jc w:val="left"/>
+            </w:pPr>
+            <w:r>
+              <w:rPr>
+                <w:b w:val="false"/>
+                <w:bCs w:val="false"/>
+                <w:sz w:val="20"/>
+                <w:szCs w:val="20"/>
+              </w:rPr>
+              <w:t>Autocomplete por histórico de preenchimento + dicionário PT-BR, com corretor ortográfico nos campos de observação</w:t>
+            </w:r>
+          </w:p>
+        </w:tc>
+        <w:tc>
+          <w:tcPr>
+            <w:tcW w:type="dxa" w:w="4513"/>
+            <w:tcBorders>
+              <w:top w:val="single" w:color="CCCCCC" w:sz="1"/>
+              <w:left w:val="single" w:color="CCCCCC" w:sz="1"/>
+              <w:bottom w:val="single" w:color="CCCCCC" w:sz="1"/>
+              <w:right w:val="single" w:color="CCCCCC" w:sz="1"/>
+            </w:tcBorders>
+            <w:tcMar>
+              <w:top w:type="dxa" w:w="80"/>
+              <w:left w:type="dxa" w:w="120"/>
+              <w:bottom w:type="dxa" w:w="80"/>
+              <w:right w:type="dxa" w:w="120"/>
+            </w:tcMar>
+            <w:vAlign w:val="center"/>
+          </w:tcPr>
+          <w:p>
+            <w:pPr>
+              <w:jc w:val="left"/>
+            </w:pPr>
+            <w:r>
+              <w:rPr>
+                <w:b w:val="false"/>
+                <w:bCs w:val="false"/>
+                <w:sz w:val="20"/>
+                <w:szCs w:val="20"/>
+              </w:rPr>
+              <w:t>Implementado</w:t>
+            </w:r>
+          </w:p>
+        </w:tc>
+      </w:tr>
+      <w:tr>
+        <w:tc>
+          <w:tcPr>
+            <w:tcW w:type="dxa" w:w="4513"/>
+            <w:tcBorders>
+              <w:top w:val="single" w:color="CCCCCC" w:sz="1"/>
+              <w:left w:val="single" w:color="CCCCCC" w:sz="1"/>
+              <w:bottom w:val="single" w:color="CCCCCC" w:sz="1"/>
+              <w:right w:val="single" w:color="CCCCCC" w:sz="1"/>
+            </w:tcBorders>
+            <w:tcMar>
+              <w:top w:type="dxa" w:w="80"/>
+              <w:left w:type="dxa" w:w="120"/>
+              <w:bottom w:type="dxa" w:w="80"/>
+              <w:right w:type="dxa" w:w="120"/>
+            </w:tcMar>
+            <w:vAlign w:val="center"/>
+          </w:tcPr>
+          <w:p>
+            <w:pPr>
+              <w:jc w:val="left"/>
+            </w:pPr>
+            <w:r>
+              <w:rPr>
+                <w:b w:val="false"/>
+                <w:bCs w:val="false"/>
+                <w:sz w:val="20"/>
+                <w:szCs w:val="20"/>
+              </w:rPr>
+              <w:t>Abas de processos (Em andamento / Concluídos / Cancelados) com alerta de dias parametrizável (tabela config)</w:t>
+            </w:r>
+          </w:p>
+        </w:tc>
+        <w:tc>
+          <w:tcPr>
+            <w:tcW w:type="dxa" w:w="4513"/>
+            <w:tcBorders>
+              <w:top w:val="single" w:color="CCCCCC" w:sz="1"/>
+              <w:left w:val="single" w:color="CCCCCC" w:sz="1"/>
+              <w:bottom w:val="single" w:color="CCCCCC" w:sz="1"/>
+              <w:right w:val="single" w:color="CCCCCC" w:sz="1"/>
+            </w:tcBorders>
+            <w:tcMar>
+              <w:top w:type="dxa" w:w="80"/>
+              <w:left w:type="dxa" w:w="120"/>
+              <w:bottom w:type="dxa" w:w="80"/>
+              <w:right w:type="dxa" w:w="120"/>
+            </w:tcMar>
+            <w:vAlign w:val="center"/>
+          </w:tcPr>
+          <w:p>
+            <w:pPr>
+              <w:jc w:val="left"/>
+            </w:pPr>
+            <w:r>
+              <w:rPr>
+                <w:b w:val="false"/>
+                <w:bCs w:val="false"/>
+                <w:sz w:val="20"/>
+                <w:szCs w:val="20"/>
+              </w:rPr>
+              <w:t>Implementado</w:t>
+            </w:r>
+          </w:p>
+        </w:tc>
+      </w:tr>
+      <w:tr>
+        <w:tc>
+          <w:tcPr>
+            <w:tcW w:type="dxa" w:w="4513"/>
+            <w:tcBorders>
+              <w:top w:val="single" w:color="CCCCCC" w:sz="1"/>
+              <w:left w:val="single" w:color="CCCCCC" w:sz="1"/>
+              <w:bottom w:val="single" w:color="CCCCCC" w:sz="1"/>
+              <w:right w:val="single" w:color="CCCCCC" w:sz="1"/>
+            </w:tcBorders>
+            <w:tcMar>
+              <w:top w:type="dxa" w:w="80"/>
+              <w:left w:type="dxa" w:w="120"/>
+              <w:bottom w:type="dxa" w:w="80"/>
+              <w:right w:type="dxa" w:w="120"/>
+            </w:tcMar>
+            <w:vAlign w:val="center"/>
+          </w:tcPr>
+          <w:p>
+            <w:pPr>
+              <w:jc w:val="left"/>
+            </w:pPr>
+            <w:r>
+              <w:rPr>
+                <w:b w:val="false"/>
+                <w:bCs w:val="false"/>
+                <w:sz w:val="20"/>
+                <w:szCs w:val="20"/>
+              </w:rPr>
+              <w:t>Linha extra de preço no cadastro do fornecedor (ex.: taxa, desconto), com valor fixo em R$ ou percentual e sinal positivo/negativo configurável por tipo</w:t>
+            </w:r>
+          </w:p>
+        </w:tc>
+        <w:tc>
+          <w:tcPr>
+            <w:tcW w:type="dxa" w:w="4513"/>
+            <w:tcBorders>
+              <w:top w:val="single" w:color="CCCCCC" w:sz="1"/>
+              <w:left w:val="single" w:color="CCCCCC" w:sz="1"/>
+              <w:bottom w:val="single" w:color="CCCCCC" w:sz="1"/>
+              <w:right w:val="single" w:color="CCCCCC" w:sz="1"/>
+            </w:tcBorders>
+            <w:tcMar>
+              <w:top w:type="dxa" w:w="80"/>
+              <w:left w:type="dxa" w:w="120"/>
+              <w:bottom w:type="dxa" w:w="80"/>
+              <w:right w:type="dxa" w:w="120"/>
+            </w:tcMar>
+            <w:vAlign w:val="center"/>
+          </w:tcPr>
+          <w:p>
+            <w:pPr>
+              <w:jc w:val="left"/>
+            </w:pPr>
+            <w:r>
+              <w:rPr>
+                <w:b w:val="false"/>
+                <w:bCs w:val="false"/>
+                <w:sz w:val="20"/>
+                <w:szCs w:val="20"/>
+              </w:rPr>
+              <w:t>Implementado</w:t>
+            </w:r>
+          </w:p>
+        </w:tc>
+      </w:tr>
+      <w:tr>
+        <w:tc>
+          <w:tcPr>
+            <w:tcW w:type="dxa" w:w="4513"/>
+            <w:tcBorders>
+              <w:top w:val="single" w:color="CCCCCC" w:sz="1"/>
+              <w:left w:val="single" w:color="CCCCCC" w:sz="1"/>
+              <w:bottom w:val="single" w:color="CCCCCC" w:sz="1"/>
+              <w:right w:val="single" w:color="CCCCCC" w:sz="1"/>
+            </w:tcBorders>
+            <w:tcMar>
+              <w:top w:type="dxa" w:w="80"/>
+              <w:left w:type="dxa" w:w="120"/>
+              <w:bottom w:type="dxa" w:w="80"/>
+              <w:right w:type="dxa" w:w="120"/>
+            </w:tcMar>
+            <w:vAlign w:val="center"/>
+          </w:tcPr>
+          <w:p>
+            <w:pPr>
+              <w:jc w:val="left"/>
+            </w:pPr>
+            <w:r>
+              <w:rPr>
+                <w:b w:val="false"/>
+                <w:bCs w:val="false"/>
+                <w:sz w:val="20"/>
+                <w:szCs w:val="20"/>
+              </w:rPr>
+              <w:t>Indicação de frete (Sim/Não) e termo (CIF/FOB) como marcações independentes</w:t>
+            </w:r>
+          </w:p>
+        </w:tc>
+        <w:tc>
+          <w:tcPr>
+            <w:tcW w:type="dxa" w:w="4513"/>
+            <w:tcBorders>
+              <w:top w:val="single" w:color="CCCCCC" w:sz="1"/>
+              <w:left w:val="single" w:color="CCCCCC" w:sz="1"/>
+              <w:bottom w:val="single" w:color="CCCCCC" w:sz="1"/>
+              <w:right w:val="single" w:color="CCCCCC" w:sz="1"/>
+            </w:tcBorders>
+            <w:tcMar>
+              <w:top w:type="dxa" w:w="80"/>
+              <w:left w:type="dxa" w:w="120"/>
+              <w:bottom w:type="dxa" w:w="80"/>
+              <w:right w:type="dxa" w:w="120"/>
+            </w:tcMar>
+            <w:vAlign w:val="center"/>
+          </w:tcPr>
+          <w:p>
+            <w:pPr>
+              <w:jc w:val="left"/>
+            </w:pPr>
+            <w:r>
+              <w:rPr>
+                <w:b w:val="false"/>
+                <w:bCs w:val="false"/>
+                <w:sz w:val="20"/>
+                <w:szCs w:val="20"/>
+              </w:rPr>
+              <w:t>Implementado</w:t>
+            </w:r>
+          </w:p>
+        </w:tc>
+      </w:tr>
+      <w:tr>
+        <w:tc>
+          <w:tcPr>
+            <w:tcW w:type="dxa" w:w="4513"/>
+            <w:tcBorders>
+              <w:top w:val="single" w:color="CCCCCC" w:sz="1"/>
+              <w:left w:val="single" w:color="CCCCCC" w:sz="1"/>
+              <w:bottom w:val="single" w:color="CCCCCC" w:sz="1"/>
+              <w:right w:val="single" w:color="CCCCCC" w:sz="1"/>
+            </w:tcBorders>
+            <w:tcMar>
+              <w:top w:type="dxa" w:w="80"/>
+              <w:left w:type="dxa" w:w="120"/>
+              <w:bottom w:type="dxa" w:w="80"/>
+              <w:right w:type="dxa" w:w="120"/>
+            </w:tcMar>
+            <w:vAlign w:val="center"/>
+          </w:tcPr>
+          <w:p>
+            <w:pPr>
+              <w:jc w:val="left"/>
+            </w:pPr>
+            <w:r>
+              <w:rPr>
+                <w:b w:val="false"/>
+                <w:bCs w:val="false"/>
+                <w:sz w:val="20"/>
+                <w:szCs w:val="20"/>
+              </w:rPr>
+              <w:t>Catálogo de Tipos de Contratação gerenciável via administração</w:t>
+            </w:r>
+          </w:p>
+        </w:tc>
+        <w:tc>
+          <w:tcPr>
+            <w:tcW w:type="dxa" w:w="4513"/>
+            <w:tcBorders>
+              <w:top w:val="single" w:color="CCCCCC" w:sz="1"/>
+              <w:left w:val="single" w:color="CCCCCC" w:sz="1"/>
+              <w:bottom w:val="single" w:color="CCCCCC" w:sz="1"/>
+              <w:right w:val="single" w:color="CCCCCC" w:sz="1"/>
+            </w:tcBorders>
+            <w:tcMar>
+              <w:top w:type="dxa" w:w="80"/>
+              <w:left w:type="dxa" w:w="120"/>
+              <w:bottom w:type="dxa" w:w="80"/>
+              <w:right w:type="dxa" w:w="120"/>
+            </w:tcMar>
+            <w:vAlign w:val="center"/>
+          </w:tcPr>
+          <w:p>
+            <w:pPr>
+              <w:jc w:val="left"/>
+            </w:pPr>
+            <w:r>
+              <w:rPr>
+                <w:b w:val="false"/>
+                <w:bCs w:val="false"/>
+                <w:sz w:val="20"/>
+                <w:szCs w:val="20"/>
+              </w:rPr>
+              <w:t>Implementado</w:t>
+            </w:r>
+          </w:p>
+        </w:tc>
+      </w:tr>
+      <w:tr>
+        <w:tc>
+          <w:tcPr>
+            <w:tcW w:type="dxa" w:w="4513"/>
+            <w:tcBorders>
+              <w:top w:val="single" w:color="CCCCCC" w:sz="1"/>
+              <w:left w:val="single" w:color="CCCCCC" w:sz="1"/>
+              <w:bottom w:val="single" w:color="CCCCCC" w:sz="1"/>
+              <w:right w:val="single" w:color="CCCCCC" w:sz="1"/>
+            </w:tcBorders>
+            <w:tcMar>
+              <w:top w:type="dxa" w:w="80"/>
+              <w:left w:type="dxa" w:w="120"/>
+              <w:bottom w:type="dxa" w:w="80"/>
+              <w:right w:type="dxa" w:w="120"/>
+            </w:tcMar>
+            <w:vAlign w:val="center"/>
+          </w:tcPr>
+          <w:p>
+            <w:pPr>
+              <w:jc w:val="left"/>
+            </w:pPr>
+            <w:r>
+              <w:rPr>
+                <w:b w:val="false"/>
+                <w:bCs w:val="false"/>
+                <w:sz w:val="20"/>
+                <w:szCs w:val="20"/>
+              </w:rPr>
+              <w:t>Indicador de versão da aplicação visível na barra lateral</w:t>
+            </w:r>
+          </w:p>
+        </w:tc>
+        <w:tc>
+          <w:tcPr>
+            <w:tcW w:type="dxa" w:w="4513"/>
+            <w:tcBorders>
+              <w:top w:val="single" w:color="CCCCCC" w:sz="1"/>
+              <w:left w:val="single" w:color="CCCCCC" w:sz="1"/>
+              <w:bottom w:val="single" w:color="CCCCCC" w:sz="1"/>
+              <w:right w:val="single" w:color="CCCCCC" w:sz="1"/>
+            </w:tcBorders>
+            <w:tcMar>
+              <w:top w:type="dxa" w:w="80"/>
+              <w:left w:type="dxa" w:w="120"/>
+              <w:bottom w:type="dxa" w:w="80"/>
+              <w:right w:type="dxa" w:w="120"/>
+            </w:tcMar>
+            <w:vAlign w:val="center"/>
+          </w:tcPr>
+          <w:p>
+            <w:pPr>
+              <w:jc w:val="left"/>
+            </w:pPr>
+            <w:r>
+              <w:rPr>
+                <w:b w:val="false"/>
+                <w:bCs w:val="false"/>
+                <w:sz w:val="20"/>
+                <w:szCs w:val="20"/>
+              </w:rPr>
+              <w:t>Implementado</w:t>
+            </w:r>
+          </w:p>
+        </w:tc>
+      </w:tr>
     </w:tbl>
     <w:p>
       <w:r>
@@ -7632,74 +9457,6 @@
                 <w:szCs w:val="20"/>
               </w:rPr>
               <w:t xml:space="preserve">Migração para SQL Server (banco corporativo CEASAMINAS)</w:t>
-            </w:r>
-          </w:p>
-        </w:tc>
-      </w:tr>
-      <w:tr>
-        <w:tc>
-          <w:tcPr>
-            <w:tcW w:type="dxa" w:w="4513"/>
-            <w:tcBorders>
-              <w:top w:val="single" w:color="CCCCCC" w:sz="1"/>
-              <w:left w:val="single" w:color="CCCCCC" w:sz="1"/>
-              <w:bottom w:val="single" w:color="CCCCCC" w:sz="1"/>
-              <w:right w:val="single" w:color="CCCCCC" w:sz="1"/>
-            </w:tcBorders>
-            <w:shd w:fill="F2F2F2" w:val="clear"/>
-            <w:tcMar>
-              <w:top w:type="dxa" w:w="80"/>
-              <w:left w:type="dxa" w:w="120"/>
-              <w:bottom w:type="dxa" w:w="80"/>
-              <w:right w:type="dxa" w:w="120"/>
-            </w:tcMar>
-            <w:vAlign w:val="center"/>
-          </w:tcPr>
-          <w:p>
-            <w:pPr>
-              <w:jc w:val="left"/>
-            </w:pPr>
-            <w:r>
-              <w:rPr>
-                <w:b w:val="false"/>
-                <w:bCs w:val="false"/>
-                <w:sz w:val="20"/>
-                <w:szCs w:val="20"/>
-              </w:rPr>
-              <w:t xml:space="preserve">Sem controle de permissões por tela</w:t>
-            </w:r>
-          </w:p>
-        </w:tc>
-        <w:tc>
-          <w:tcPr>
-            <w:tcW w:type="dxa" w:w="4513"/>
-            <w:tcBorders>
-              <w:top w:val="single" w:color="CCCCCC" w:sz="1"/>
-              <w:left w:val="single" w:color="CCCCCC" w:sz="1"/>
-              <w:bottom w:val="single" w:color="CCCCCC" w:sz="1"/>
-              <w:right w:val="single" w:color="CCCCCC" w:sz="1"/>
-            </w:tcBorders>
-            <w:shd w:fill="F2F2F2" w:val="clear"/>
-            <w:tcMar>
-              <w:top w:type="dxa" w:w="80"/>
-              <w:left w:type="dxa" w:w="120"/>
-              <w:bottom w:type="dxa" w:w="80"/>
-              <w:right w:type="dxa" w:w="120"/>
-            </w:tcMar>
-            <w:vAlign w:val="center"/>
-          </w:tcPr>
-          <w:p>
-            <w:pPr>
-              <w:jc w:val="left"/>
-            </w:pPr>
-            <w:r>
-              <w:rPr>
-                <w:b w:val="false"/>
-                <w:bCs w:val="false"/>
-                <w:sz w:val="20"/>
-                <w:szCs w:val="20"/>
-              </w:rPr>
-              <w:t xml:space="preserve">Sistema de roles granular (admin, operador, visualizador)</w:t>
             </w:r>
           </w:p>
         </w:tc>

</xml_diff>